<commit_message>
Cover letter: bold key metrics/terms for scannability
</commit_message>
<xml_diff>
--- a/applications/bolt-new__senior-applied-engineer/cover-letter.docx
+++ b/applications/bolt-new__senior-applied-engineer/cover-letter.docx
@@ -23,7 +23,78 @@
         <w:pStyle w:val="BodyText"/>
       </w:pPr>
       <w:r>
-        <w:t xml:space="preserve">At VTS, I built an agentic document-intelligence pipeline that abstracts structured terms from commercial real-estate leases with structured-output validation. When field-level accuracy dropped 10 points, I treated it as a data problem: I analyzed failure modes across multi-turn extraction, then redesigned the prompt strategy and image preprocessing to recover the full drop and restore the roughly 88% baseline. That loop of measure, diagnose, and iterate is how I think agents get reliable.</w:t>
+        <w:t xml:space="preserve">At VTS, I built an</w:t>
+      </w:r>
+      <w:r>
+        <w:t xml:space="preserve"> </w:t>
+      </w:r>
+      <w:r>
+        <w:rPr>
+          <w:b/>
+          <w:bCs/>
+        </w:rPr>
+        <w:t xml:space="preserve">agentic document-intelligence pipeline</w:t>
+      </w:r>
+      <w:r>
+        <w:t xml:space="preserve"> </w:t>
+      </w:r>
+      <w:r>
+        <w:t xml:space="preserve">that abstracts structured terms from commercial real-estate leases with</w:t>
+      </w:r>
+      <w:r>
+        <w:t xml:space="preserve"> </w:t>
+      </w:r>
+      <w:r>
+        <w:rPr>
+          <w:b/>
+          <w:bCs/>
+        </w:rPr>
+        <w:t xml:space="preserve">structured-output validation</w:t>
+      </w:r>
+      <w:r>
+        <w:t xml:space="preserve">. When field-level accuracy dropped</w:t>
+      </w:r>
+      <w:r>
+        <w:t xml:space="preserve"> </w:t>
+      </w:r>
+      <w:r>
+        <w:rPr>
+          <w:b/>
+          <w:bCs/>
+        </w:rPr>
+        <w:t xml:space="preserve">10 points</w:t>
+      </w:r>
+      <w:r>
+        <w:t xml:space="preserve">, I treated it as a data problem: I</w:t>
+      </w:r>
+      <w:r>
+        <w:t xml:space="preserve"> </w:t>
+      </w:r>
+      <w:r>
+        <w:rPr>
+          <w:b/>
+          <w:bCs/>
+        </w:rPr>
+        <w:t xml:space="preserve">analyzed failure modes</w:t>
+      </w:r>
+      <w:r>
+        <w:t xml:space="preserve"> </w:t>
+      </w:r>
+      <w:r>
+        <w:t xml:space="preserve">across multi-turn extraction, then redesigned the prompt strategy and image preprocessing to recover the full drop and restore the</w:t>
+      </w:r>
+      <w:r>
+        <w:t xml:space="preserve"> </w:t>
+      </w:r>
+      <w:r>
+        <w:rPr>
+          <w:b/>
+          <w:bCs/>
+        </w:rPr>
+        <w:t xml:space="preserve">~88% baseline</w:t>
+      </w:r>
+      <w:r>
+        <w:t xml:space="preserve">. That loop of measure, diagnose, and iterate is how I think agents get reliable.</w:t>
       </w:r>
     </w:p>
     <w:p>
@@ -31,7 +102,158 @@
         <w:pStyle w:val="BodyText"/>
       </w:pPr>
       <w:r>
-        <w:t xml:space="preserve">Context and cost are the other half. On a GenAI platform processing 2M+ records a month, I built a Strategy Router that classifies each field by complexity and routes about 60% to deterministic parsers, reserving the LLM for the rest and cutting token spend roughly 40% with no measurable accuracy loss. I have orchestrated multi-step, multi-agent workflows with tool and function calling over MCP, and I built CI evaluation gates (RAGAS) that block deploys when faithfulness or answer-relevancy slips. I have also chosen models on evidence, fine-tuning Llama-3-8B to replace GPT-4 for a structured task after benchmarking, holding 98% schema compliance while cutting per-token cost 90%.</w:t>
+        <w:t xml:space="preserve">Context and cost are the other half. On a GenAI platform processing</w:t>
+      </w:r>
+      <w:r>
+        <w:t xml:space="preserve"> </w:t>
+      </w:r>
+      <w:r>
+        <w:rPr>
+          <w:b/>
+          <w:bCs/>
+        </w:rPr>
+        <w:t xml:space="preserve">2M+ records/month</w:t>
+      </w:r>
+      <w:r>
+        <w:t xml:space="preserve">, I built a</w:t>
+      </w:r>
+      <w:r>
+        <w:t xml:space="preserve"> </w:t>
+      </w:r>
+      <w:r>
+        <w:rPr>
+          <w:b/>
+          <w:bCs/>
+        </w:rPr>
+        <w:t xml:space="preserve">Strategy Router</w:t>
+      </w:r>
+      <w:r>
+        <w:t xml:space="preserve"> </w:t>
+      </w:r>
+      <w:r>
+        <w:t xml:space="preserve">that classifies each field by complexity and routes about</w:t>
+      </w:r>
+      <w:r>
+        <w:t xml:space="preserve"> </w:t>
+      </w:r>
+      <w:r>
+        <w:rPr>
+          <w:b/>
+          <w:bCs/>
+        </w:rPr>
+        <w:t xml:space="preserve">60%</w:t>
+      </w:r>
+      <w:r>
+        <w:t xml:space="preserve"> </w:t>
+      </w:r>
+      <w:r>
+        <w:t xml:space="preserve">to deterministic parsers, reserving the LLM for the rest and</w:t>
+      </w:r>
+      <w:r>
+        <w:t xml:space="preserve"> </w:t>
+      </w:r>
+      <w:r>
+        <w:rPr>
+          <w:b/>
+          <w:bCs/>
+        </w:rPr>
+        <w:t xml:space="preserve">cutting token spend ~40%</w:t>
+      </w:r>
+      <w:r>
+        <w:t xml:space="preserve"> </w:t>
+      </w:r>
+      <w:r>
+        <w:t xml:space="preserve">with no measurable accuracy loss. I have orchestrated</w:t>
+      </w:r>
+      <w:r>
+        <w:t xml:space="preserve"> </w:t>
+      </w:r>
+      <w:r>
+        <w:rPr>
+          <w:b/>
+          <w:bCs/>
+        </w:rPr>
+        <w:t xml:space="preserve">multi-step, multi-agent workflows</w:t>
+      </w:r>
+      <w:r>
+        <w:t xml:space="preserve"> </w:t>
+      </w:r>
+      <w:r>
+        <w:t xml:space="preserve">with</w:t>
+      </w:r>
+      <w:r>
+        <w:t xml:space="preserve"> </w:t>
+      </w:r>
+      <w:r>
+        <w:rPr>
+          <w:b/>
+          <w:bCs/>
+        </w:rPr>
+        <w:t xml:space="preserve">tool/function calling over MCP</w:t>
+      </w:r>
+      <w:r>
+        <w:t xml:space="preserve">, and built</w:t>
+      </w:r>
+      <w:r>
+        <w:t xml:space="preserve"> </w:t>
+      </w:r>
+      <w:r>
+        <w:rPr>
+          <w:b/>
+          <w:bCs/>
+        </w:rPr>
+        <w:t xml:space="preserve">CI evaluation gates (RAGAS)</w:t>
+      </w:r>
+      <w:r>
+        <w:t xml:space="preserve"> </w:t>
+      </w:r>
+      <w:r>
+        <w:t xml:space="preserve">that block deploys when faithfulness or answer-relevancy slips. I also choose models on evidence: I</w:t>
+      </w:r>
+      <w:r>
+        <w:t xml:space="preserve"> </w:t>
+      </w:r>
+      <w:r>
+        <w:rPr>
+          <w:b/>
+          <w:bCs/>
+        </w:rPr>
+        <w:t xml:space="preserve">fine-tuned Llama-3-8B to replace GPT-4</w:t>
+      </w:r>
+      <w:r>
+        <w:t xml:space="preserve"> </w:t>
+      </w:r>
+      <w:r>
+        <w:t xml:space="preserve">for a structured task, holding</w:t>
+      </w:r>
+      <w:r>
+        <w:t xml:space="preserve"> </w:t>
+      </w:r>
+      <w:r>
+        <w:rPr>
+          <w:b/>
+          <w:bCs/>
+        </w:rPr>
+        <w:t xml:space="preserve">98% schema compliance</w:t>
+      </w:r>
+      <w:r>
+        <w:t xml:space="preserve"> </w:t>
+      </w:r>
+      <w:r>
+        <w:t xml:space="preserve">while</w:t>
+      </w:r>
+      <w:r>
+        <w:t xml:space="preserve"> </w:t>
+      </w:r>
+      <w:r>
+        <w:rPr>
+          <w:b/>
+          <w:bCs/>
+        </w:rPr>
+        <w:t xml:space="preserve">cutting per-token cost 90%</w:t>
+      </w:r>
+      <w:r>
+        <w:t xml:space="preserve">.</w:t>
       </w:r>
     </w:p>
     <w:p>
@@ -39,7 +261,55 @@
         <w:pStyle w:val="BodyText"/>
       </w:pPr>
       <w:r>
-        <w:t xml:space="preserve">What pulls me to Bolt is the pace and the stakes: an agent shipping to millions, where context management and tool orchestration are the product, not a feature. I work daily across Python and TypeScript and like owning problems end to end. I would love to help push what these agents can reliably build.</w:t>
+        <w:t xml:space="preserve">What pulls me to Bolt is the pace and the stakes: an agent shipping to millions, where</w:t>
+      </w:r>
+      <w:r>
+        <w:t xml:space="preserve"> </w:t>
+      </w:r>
+      <w:r>
+        <w:rPr>
+          <w:b/>
+          <w:bCs/>
+        </w:rPr>
+        <w:t xml:space="preserve">context management</w:t>
+      </w:r>
+      <w:r>
+        <w:t xml:space="preserve"> </w:t>
+      </w:r>
+      <w:r>
+        <w:t xml:space="preserve">and</w:t>
+      </w:r>
+      <w:r>
+        <w:t xml:space="preserve"> </w:t>
+      </w:r>
+      <w:r>
+        <w:rPr>
+          <w:b/>
+          <w:bCs/>
+        </w:rPr>
+        <w:t xml:space="preserve">tool orchestration</w:t>
+      </w:r>
+      <w:r>
+        <w:t xml:space="preserve"> </w:t>
+      </w:r>
+      <w:r>
+        <w:t xml:space="preserve">are the product, not a feature. I work daily across</w:t>
+      </w:r>
+      <w:r>
+        <w:t xml:space="preserve"> </w:t>
+      </w:r>
+      <w:r>
+        <w:rPr>
+          <w:b/>
+          <w:bCs/>
+        </w:rPr>
+        <w:t xml:space="preserve">Python and TypeScript</w:t>
+      </w:r>
+      <w:r>
+        <w:t xml:space="preserve"> </w:t>
+      </w:r>
+      <w:r>
+        <w:t xml:space="preserve">and like owning problems end to end. I would love to help push what these agents can reliably build.</w:t>
       </w:r>
     </w:p>
     <w:p>

</xml_diff>